<commit_message>
Finished the statement of Goals
</commit_message>
<xml_diff>
--- a/Statement_of_Goals_and_Choices.docx
+++ b/Statement_of_Goals_and_Choices.docx
@@ -4,95 +4,134 @@
   <w:body>
     <w:p>
       <w:pPr>
-        <w:pStyle w:val="Title"/>
+        <w:ind w:firstLine="0"/>
+        <w:jc w:val="left"/>
       </w:pPr>
       <w:r>
-        <w:t>Statement of Goals and Choices</w:t>
+        <w:t>Vincent Iyegbuye</w:t>
       </w:r>
     </w:p>
     <w:p>
       <w:pPr>
-        <w:pStyle w:val="Subtitle"/>
+        <w:ind w:firstLine="0"/>
+        <w:jc w:val="left"/>
       </w:pPr>
       <w:r>
-        <w:t>Far From Home: Finding Belonging at Texas Tech</w:t>
+        <w:t>[Instructor's Name]</w:t>
       </w:r>
     </w:p>
     <w:p>
+      <w:pPr>
+        <w:ind w:firstLine="0"/>
+        <w:jc w:val="left"/>
+      </w:pPr>
       <w:r>
-        <w:rPr>
-          <w:b/>
-        </w:rPr>
-        <w:t xml:space="preserve">Research question, purpose and audience. </w:t>
-      </w:r>
-      <w:r>
-        <w:t>My inquiry asks how international students at Texas Tech adjust to life in Lubbock and what makes the area feel like home—or not. I wanted to move beyond a simple description of the campus and ask about relationships, routines, and practical conditions that affect everyday life. The audience I have in mind includes incoming international students, current Texas Tech students who may recognize these experiences, and readers who live in Lubbock but may not often hear the perspective of newcomers. The website is meant to invite reflection rather than prove that Texas Tech is welcoming or unwelcoming for everyone. In particular, I hoped to show why appreciating a place is not always the same as calling it home.</w:t>
+        <w:t>ENGL 1301</w:t>
       </w:r>
     </w:p>
     <w:p>
+      <w:pPr>
+        <w:ind w:firstLine="0"/>
+        <w:jc w:val="left"/>
+      </w:pPr>
       <w:r>
-        <w:rPr>
-          <w:b/>
-        </w:rPr>
-        <w:t xml:space="preserve">How I researched the question. </w:t>
-      </w:r>
-      <w:r>
-        <w:t>The core of the project is four interviews with international students who had different amounts of experience in Lubbock. I used a shared group of questions about expectations, adjustments, cultural differences, relationships, comfortable places and the meaning of home. Using many of the same questions helped me notice both overlap and disagreement. The earlier participants discussed arriving in a town they expected to be quiet. The later accounts added the perspectives of a student with several years of experience and a student who described the difference between attachment to a community and attachment to a city. The resulting story does not claim that four interviews represent all international students. I kept names out of the report and separated what participants said from my interpretation of their responses. Some captions were edited or paraphrased, so the written record acknowledges those limits rather than treating every line as a verified quotation.</w:t>
+        <w:t>29 October 2026</w:t>
       </w:r>
     </w:p>
     <w:p>
+      <w:pPr>
+        <w:ind w:firstLine="0"/>
+        <w:jc w:val="center"/>
+      </w:pPr>
       <w:r>
-        <w:rPr>
-          <w:b/>
-        </w:rPr>
-        <w:t xml:space="preserve">Why I chose a multimodal web essay. </w:t>
-      </w:r>
-      <w:r>
-        <w:t>I chose a website instead of a conventional written essay because this research relies on voices as well as words. The embedded interviews allow a visitor to hear tone, hesitation and emphasis; the expandable transcripts let someone read the responses rather than play every recording. The different ways of entering the material matter. A reader can follow the narrative, listen to all four students, open a single interview, or examine one comparison of what home means to them. Keeping the transcripts separate from the main story also helped the main writing stay exploratory rather than turning into a long list of questions and answers. I used HTML, CSS and JavaScript because they let me update content while keeping the presentation accessible through a browser and shareable by a single link on GitHub Pages.</w:t>
+        <w:t>Far From Home: Statement of Goals and Choices</w:t>
       </w:r>
     </w:p>
     <w:p>
+      <w:pPr>
+        <w:ind w:firstLine="720"/>
+        <w:jc w:val="left"/>
+      </w:pPr>
       <w:r>
-        <w:rPr>
-          <w:b/>
-        </w:rPr>
-        <w:t xml:space="preserve">Choices about visual evidence and organization. </w:t>
-      </w:r>
-      <w:r>
-        <w:t>The organization moves from arrival to familiar places, movement around Lubbock and the question of home. That order follows the interview questions but also reflects the direction my thinking took as I compared responses. I chose photographs of the library, Student Union, and a Lubbock Citibus bus because participants referred to study spaces, work and movement around the city. These photographs illustrate locations and services; they do not document any of the specific interview experiences. I used photographs of Texas Tech from an identified Creative Commons source and credited the photographer rather than implying that I personally observed the scenes shown. I also researched Tree of Restoration, a church named by participants, and its descriptions of hospitality and transportation. Those details helped me ask how belonging might be created through concrete practices such as being welcomed or getting a ride. Official TOR images require a separate permission check before public reuse, so this is an ethical constraint rather than something that a credit line automatically resolves.</w:t>
+        <w:t>My inquiry for Far From Home began with a question: How do international students at Texas Tech navigate adjustment and develop a sense of belonging in Lubbock? I wanted to investigate what living here actually feels like, not just describe the campus or list activities available to students. My personal interest came from thinking about how people can move to a new place, attend classes, and develop routines without necessarily feeling that they belong. I hoped to understand the connections between friendships, everyday spaces, culture, and practical conditions such as transportation. The audience I had in mind included incoming international students, other Texas Tech students, and Lubbock residents who might not regularly hear these perspectives. My rhetorical goal was to invite those readers to listen and reflect, rather than convince them that Lubbock is either a good or a bad place for international students.</w:t>
       </w:r>
     </w:p>
     <w:p>
+      <w:pPr>
+        <w:ind w:firstLine="720"/>
+        <w:jc w:val="left"/>
+      </w:pPr>
       <w:r>
-        <w:rPr>
-          <w:b/>
-        </w:rPr>
-        <w:t xml:space="preserve">How secondary research contributed. </w:t>
-      </w:r>
-      <w:r>
-        <w:t>My primary research remains central, but secondary research gives the interviews additional context. Texas Tech's Global Guides pages describe institutional attempts to help arriving students adjust. University transportation pages explain which types of mobility services exist, while participants' accounts describe what they can actually do with the options available to them. Scholarly reviews of international student belonging helped me avoid treating the concept as if it had a single straightforward meaning. This distinction is important: the university can describe a program and a study can describe a wider pattern, but neither source can replace the particular circumstances of the students I interviewed. The secondary sources therefore create comparisons and questions instead of being used to declare the interviewees right or wrong.</w:t>
+        <w:t>I made four student interviews the foundation of the project. Three participants are originally from Nigeria, and one is from Ghana. They had spent different amounts of time at Texas Tech and had different experiences before arriving in Lubbock. I asked a shared set of questions about first impressions, cultural differences, places they felt comfortable, relationships, and what they meant by home. Having similar questions made it easier to compare their answers, but I also followed up when an answer raised something unexpected. The later interviews included a more direct question about transportation and other everyday conditions. That difference in my method is a limitation: I cannot make a direct comparison about transportation across all four participants, and four interviews cannot represent the entire international student community. Still, their different accounts helped me ask more specific questions than I had at the beginning.</w:t>
       </w:r>
     </w:p>
     <w:p>
+      <w:pPr>
+        <w:ind w:firstLine="720"/>
+        <w:jc w:val="left"/>
+      </w:pPr>
       <w:r>
-        <w:rPr>
-          <w:b/>
-        </w:rPr>
-        <w:t xml:space="preserve">Risks, limitations and revisions. </w:t>
-      </w:r>
-      <w:r>
-        <w:t>This process involved several practical and rhetorical risks. Early versions of the project looked like a generic interactive template. I revised the site toward a documentary style because the interview evidence should be more visible than decorative interaction. Expanding from one interview to four also required changing the analysis instead of merely attaching more recordings. Another risk is generalization. Three participants are originally from Nigeria and one from Ghana, and they do not represent every background or length of residence. The later conversations also raised transportation, a topic the original research question did not emphasize as strongly. That finding shifted my focus from belonging as a feeling to belonging as something affected by where a student can go. Finally, public media projects introduce ethical obligations: permission for audio, transcription uncertainty, picture credits and accessibility. I have tried to address these openly rather than conceal them behind a polished design. The result is not a universal explanation of home. It is a research-based invitation to notice how different students make—or have difficulty making—Lubbock their place.</w:t>
+        <w:t>The interviews changed what I thought the word home would mean. Participant 01 described Nigeria, Virginia, and Lubbock as different homes, while also explaining that many of the people closest to her were elsewhere. Participant 02 enjoyed Texas Tech and felt welcomed, but did not call Lubbock a second home; he also talked about family in Houston. Participant 03 connected her sense of comfort to friends and church, while still thinking about Dallas. Participant 04 made an especially useful distinction between the physical city of Lubbock and the community that felt like home to her. I could have presented these as four separate stories, but that would have left readers to find the connections themselves. Instead, I organized the website to compare the answers and consider how belonging might depend on people, time, and access to everyday places.</w:t>
       </w:r>
     </w:p>
     <w:p>
+      <w:pPr>
+        <w:ind w:firstLine="720"/>
+        <w:jc w:val="left"/>
+      </w:pPr>
       <w:r>
-        <w:t>Source note: Descriptions of interviews and publishing choices refer to the accompanying web essay. Review and personalize this statement to reflect your own actual decisions and permissions before submitting.</w:t>
+        <w:t>I chose an interactive website rather than a slideshow, podcast, or conventional essay because I wanted readers to move between my interpretation and the participants' own voices. The finished project has five chapters: Arriving in Lubbock, Finding Your People, Life Beyond Campus, What Makes a Place Home?, and What I Discovered. This sequence begins with first impressions, turns to relationships and routine places, considers the material problem of getting around, and finally revisits the meaning of home. It also reflects a change in my thinking during the research. At first, I mainly expected to discuss culture and friendship. The transportation responses made me consider that even when an event or community is welcoming, reaching it may involve time, money, or dependence on a bus or another person. This is why I gave transportation its own chapter instead of treating it as a minor detail.</w:t>
+      </w:r>
+    </w:p>
+    <w:p>
+      <w:pPr>
+        <w:ind w:firstLine="720"/>
+        <w:jc w:val="left"/>
+      </w:pPr>
+      <w:r>
+        <w:t>The website combines writing, photographs, original recordings, and an interactive comparison. I used HTML and CSS to create a chapter-based layout and JavaScript for navigation, audio controls, and buttons that let readers switch between the four participants' understandings of home. Five short audio excerpts are placed beside the parts of the discussion they support, so a visitor can hear a relevant moment without first listening to every full interview. I also kept all four complete recordings and readable interview text in a source archive. I did not want the short clips to replace the fuller conversations or make one carefully chosen line seem like the whole story. Visitors can read in sequence, compare participants, or explore the source material at their own pace. Publishing the project as a GitHub Pages website also made it possible to share one link rather than asking the audience to download a presentation.</w:t>
+      </w:r>
+    </w:p>
+    <w:p>
+      <w:pPr>
+        <w:ind w:firstLine="720"/>
+        <w:jc w:val="left"/>
+      </w:pPr>
+      <w:r>
+        <w:t>My choices about images required the same attention to purpose and evidence. I included campus photographs because the library and Student Union are familiar spaces mentioned in the interviews, while a transit image helps readers understand the discussion about moving around Lubbock. I also included photographs from Tree of Restoration, a church discussed in the interviews, after obtaining permission to use the organization's images for this project. I kept source links and credits because permission does not make attribution unnecessary. The campus photographs used in the section titled Three Spaces. More Questions are archival images, not pictures I took while conducting observations. I revised that section from an unfinished field-note guide into a reflection on what photographs can and cannot reveal. A picture can show where a building is, but it cannot tell us whether a student feels understood there. That distinction protects the project from claiming firsthand observations I did not conduct.</w:t>
+      </w:r>
+    </w:p>
+    <w:p>
+      <w:pPr>
+        <w:ind w:firstLine="720"/>
+        <w:jc w:val="left"/>
+      </w:pPr>
+      <w:r>
+        <w:t>Secondary sources provided context, but I deliberately kept them in a supporting role. Texas Tech's Global Guides and student connection resources describe programs intended to help students, while university transportation pages explain services such as campus buses and Raider Ride. I compared those descriptions with the interviews rather than assuming that a program's existence proves it meets every student's needs. Scholarly research on international student social interactions and belonging also helped me recognize that relationships and a sense of home can take different forms. These sources gave readers useful background, but the interpretations in my chapters came mainly from the four conversations. That decision was important because the assignment asks for primary research and discovery, not an argument built primarily from other people's published conclusions.</w:t>
+      </w:r>
+    </w:p>
+    <w:p>
+      <w:pPr>
+        <w:ind w:firstLine="720"/>
+        <w:jc w:val="left"/>
+      </w:pPr>
+      <w:r>
+        <w:t>The project involved several risks and compromises. I originally experimented with formats that looked more like a generic interactive template, but I revised the design so the interviews and my analysis remained central. Expanding the project to four voices required more than adding audio files: I had to reorganize the story and make room for disagreement. I also had to consider privacy and accuracy. The public narrative identifies interviewees by participant number rather than name, and I distinguish direct quotations from paraphrases. The accompanying accessibility transcript document labels caption-assisted and edited passages rather than pretending every sentence is a word-for-word record. I made these choices because presenting someone else's experience carries responsibilities, especially when visitors can hear the original recording. Another limitation is that my participants come from only two countries, and not every student had the same follow-up questions. These decisions and constraints mean the project can reveal possibilities and tensions, but not offer a universal answer.</w:t>
+      </w:r>
+    </w:p>
+    <w:p>
+      <w:pPr>
+        <w:ind w:firstLine="720"/>
+        <w:jc w:val="left"/>
+      </w:pPr>
+      <w:r>
+        <w:t>What I value most about the finished website is that it leaves the question open in a more useful way than when I started. I expected to ask whether Lubbock felt like home, but I learned to pay attention to the difference between being welcomed, having a routine, finding a community, and feeling attached to a city. The combination of audio, written interpretation, photographs, and participant comparisons allows readers to encounter that difference in more than one way. Far From Home does not claim to speak for every international student at Texas Tech. Its purpose is to make four particular experiences visible and encourage a more careful conversation about what it takes to find a home in Lubbock.</w:t>
       </w:r>
     </w:p>
     <w:sectPr>
-      <w:footerReference w:type="default" r:id="rId9"/>
+      <w:headerReference w:type="default" r:id="rId9"/>
       <w:pgSz w:w="12240" w:h="15840"/>
-      <w:pgMar w:top="1181" w:right="1296" w:bottom="1123" w:left="1296" w:header="720" w:footer="720" w:gutter="0"/>
+      <w:pgMar w:top="1440" w:right="1440" w:bottom="1440" w:left="1440" w:header="720" w:footer="720" w:gutter="0"/>
       <w:cols w:space="720"/>
       <w:docGrid w:linePitch="360"/>
     </w:sectPr>
@@ -100,18 +139,23 @@
 </w:document>
 </file>
 
-<file path=word/footer1.xml><?xml version="1.0" encoding="utf-8"?>
-<w:ftr xmlns:m="http://schemas.openxmlformats.org/officeDocument/2006/math" xmlns:mc="http://schemas.openxmlformats.org/markup-compatibility/2006" xmlns:mo="http://schemas.microsoft.com/office/mac/office/2008/main" xmlns:mv="urn:schemas-microsoft-com:mac:vml" xmlns:o="urn:schemas-microsoft-com:office:office" xmlns:r="http://schemas.openxmlformats.org/officeDocument/2006/relationships" xmlns:v="urn:schemas-microsoft-com:vml" xmlns:w10="urn:schemas-microsoft-com:office:word" xmlns:w14="http://schemas.microsoft.com/office/word/2010/wordml" xmlns:w="http://schemas.openxmlformats.org/wordprocessingml/2006/main" xmlns:wne="http://schemas.microsoft.com/office/word/2006/wordml" xmlns:wp14="http://schemas.microsoft.com/office/word/2010/wordprocessingDrawing" xmlns:wp="http://schemas.openxmlformats.org/drawingml/2006/wordprocessingDrawing" xmlns:wpc="http://schemas.microsoft.com/office/word/2010/wordprocessingCanvas" xmlns:wpg="http://schemas.microsoft.com/office/word/2010/wordprocessingGroup" xmlns:wpi="http://schemas.microsoft.com/office/word/2010/wordprocessingInk" xmlns:wps="http://schemas.microsoft.com/office/word/2010/wordprocessingShape" mc:Ignorable="w14 wp14">
+<file path=word/header1.xml><?xml version="1.0" encoding="utf-8"?>
+<w:hdr xmlns:m="http://schemas.openxmlformats.org/officeDocument/2006/math" xmlns:mc="http://schemas.openxmlformats.org/markup-compatibility/2006" xmlns:mo="http://schemas.microsoft.com/office/mac/office/2008/main" xmlns:mv="urn:schemas-microsoft-com:mac:vml" xmlns:o="urn:schemas-microsoft-com:office:office" xmlns:r="http://schemas.openxmlformats.org/officeDocument/2006/relationships" xmlns:v="urn:schemas-microsoft-com:vml" xmlns:w10="urn:schemas-microsoft-com:office:word" xmlns:w14="http://schemas.microsoft.com/office/word/2010/wordml" xmlns:w="http://schemas.openxmlformats.org/wordprocessingml/2006/main" xmlns:wne="http://schemas.microsoft.com/office/word/2006/wordml" xmlns:wp14="http://schemas.microsoft.com/office/word/2010/wordprocessingDrawing" xmlns:wp="http://schemas.openxmlformats.org/drawingml/2006/wordprocessingDrawing" xmlns:wpc="http://schemas.microsoft.com/office/word/2010/wordprocessingCanvas" xmlns:wpg="http://schemas.microsoft.com/office/word/2010/wordprocessingGroup" xmlns:wpi="http://schemas.microsoft.com/office/word/2010/wordprocessingInk" xmlns:wps="http://schemas.microsoft.com/office/word/2010/wordprocessingShape" mc:Ignorable="w14 wp14">
   <w:p>
     <w:pPr>
-      <w:pStyle w:val="Caption"/>
-      <w:jc w:val="center"/>
+      <w:spacing w:line="240" w:lineRule="auto" w:after="0"/>
+      <w:jc w:val="right"/>
     </w:pPr>
     <w:r>
-      <w:t>ENGL 1301 · Far From Home · October 2026</w:t>
+      <w:rPr>
+        <w:rFonts w:ascii="Times New Roman" w:hAnsi="Times New Roman"/>
+        <w:sz w:val="24"/>
+      </w:rPr>
+      <w:t xml:space="preserve">Iyegbuye </w:t>
     </w:r>
+    <w:fldSimple w:instr="PAGE"/>
   </w:p>
-</w:ftr>
+</w:hdr>
 </file>
 
 <file path=word/numbering.xml><?xml version="1.0" encoding="utf-8"?>
@@ -478,11 +522,12 @@
     <w:qFormat/>
     <w:rsid w:val="00FC693F"/>
     <w:pPr>
-      <w:spacing w:after="120" w:line="480" w:lineRule="auto"/>
+      <w:widowControl/>
+      <w:spacing w:before="0" w:after="0" w:line="480" w:lineRule="auto"/>
     </w:pPr>
     <w:rPr>
-      <w:rFonts w:ascii="Aptos" w:hAnsi="Aptos"/>
-      <w:sz w:val="22"/>
+      <w:rFonts w:ascii="Times New Roman" w:hAnsi="Times New Roman"/>
+      <w:sz w:val="24"/>
     </w:rPr>
   </w:style>
   <w:style w:type="paragraph" w:styleId="Header">
@@ -544,10 +589,10 @@
       <w:outlineLvl w:val="0"/>
     </w:pPr>
     <w:rPr>
-      <w:rFonts w:asciiTheme="majorHAnsi" w:eastAsiaTheme="majorEastAsia" w:hAnsiTheme="majorHAnsi" w:cstheme="majorBidi" w:ascii="Aptos" w:hAnsi="Aptos"/>
+      <w:rFonts w:asciiTheme="majorHAnsi" w:eastAsiaTheme="majorEastAsia" w:hAnsiTheme="majorHAnsi" w:cstheme="majorBidi"/>
       <w:b/>
       <w:bCs/>
-      <w:color w:val="1F2B34"/>
+      <w:color w:val="365F91" w:themeColor="accent1" w:themeShade="BF"/>
       <w:sz w:val="28"/>
       <w:szCs w:val="28"/>
     </w:rPr>
@@ -568,11 +613,11 @@
       <w:outlineLvl w:val="1"/>
     </w:pPr>
     <w:rPr>
-      <w:rFonts w:asciiTheme="majorHAnsi" w:eastAsiaTheme="majorEastAsia" w:hAnsiTheme="majorHAnsi" w:cstheme="majorBidi" w:ascii="Aptos" w:hAnsi="Aptos"/>
+      <w:rFonts w:asciiTheme="majorHAnsi" w:eastAsiaTheme="majorEastAsia" w:hAnsiTheme="majorHAnsi" w:cstheme="majorBidi"/>
       <w:b/>
       <w:bCs/>
-      <w:color w:val="1F2B34"/>
-      <w:sz w:val="22"/>
+      <w:color w:val="4F81BD" w:themeColor="accent1"/>
+      <w:sz w:val="26"/>
       <w:szCs w:val="26"/>
     </w:rPr>
   </w:style>
@@ -833,12 +878,11 @@
       <w:contextualSpacing/>
     </w:pPr>
     <w:rPr>
-      <w:rFonts w:asciiTheme="majorHAnsi" w:eastAsiaTheme="majorEastAsia" w:hAnsiTheme="majorHAnsi" w:cstheme="majorBidi" w:ascii="Aptos" w:hAnsi="Aptos"/>
-      <w:b/>
-      <w:color w:val="1F2B34"/>
+      <w:rFonts w:asciiTheme="majorHAnsi" w:eastAsiaTheme="majorEastAsia" w:hAnsiTheme="majorHAnsi" w:cstheme="majorBidi"/>
+      <w:color w:val="17365D" w:themeColor="text2" w:themeShade="BF"/>
       <w:spacing w:val="5"/>
       <w:kern w:val="28"/>
-      <w:sz w:val="36"/>
+      <w:sz w:val="52"/>
       <w:szCs w:val="52"/>
     </w:rPr>
   </w:style>

</xml_diff>